<commit_message>
add final documentation and team agreement
</commit_message>
<xml_diff>
--- a/5_final_documentation/Template_Team Agreement.docx
+++ b/5_final_documentation/Template_Team Agreement.docx
@@ -1,6 +1,6 @@
 
 <file path=word/document.xml><?xml version="1.0" encoding="utf-8"?>
-<w:document xmlns:wpc="http://schemas.microsoft.com/office/word/2010/wordprocessingCanvas" xmlns:cx="http://schemas.microsoft.com/office/drawing/2014/chartex" xmlns:cx1="http://schemas.microsoft.com/office/drawing/2015/9/8/chartex" xmlns:cx2="http://schemas.microsoft.com/office/drawing/2015/10/21/chartex" xmlns:cx3="http://schemas.microsoft.com/office/drawing/2016/5/9/chartex" xmlns:cx4="http://schemas.microsoft.com/office/drawing/2016/5/10/chartex" xmlns:cx5="http://schemas.microsoft.com/office/drawing/2016/5/11/chartex" xmlns:cx6="http://schemas.microsoft.com/office/drawing/2016/5/12/chartex" xmlns:cx7="http://schemas.microsoft.com/office/drawing/2016/5/13/chartex" xmlns:cx8="http://schemas.microsoft.com/office/drawing/2016/5/14/chartex" xmlns:mc="http://schemas.openxmlformats.org/markup-compatibility/2006" xmlns:aink="http://schemas.microsoft.com/office/drawing/2016/ink" xmlns:am3d="http://schemas.microsoft.com/office/drawing/2017/model3d" xmlns:o="urn:schemas-microsoft-com:office:office" xmlns:oel="http://schemas.microsoft.com/office/2019/extlst" xmlns:r="http://schemas.openxmlformats.org/officeDocument/2006/relationships" xmlns:m="http://schemas.openxmlformats.org/officeDocument/2006/math" xmlns:v="urn:schemas-microsoft-com:vml" xmlns:wp14="http://schemas.microsoft.com/office/word/2010/wordprocessingDrawing" xmlns:wp="http://schemas.openxmlformats.org/drawingml/2006/wordprocessingDrawing" xmlns:w10="urn:schemas-microsoft-com:office:word" xmlns:w="http://schemas.openxmlformats.org/wordprocessingml/2006/main" xmlns:w14="http://schemas.microsoft.com/office/word/2010/wordml" xmlns:w15="http://schemas.microsoft.com/office/word/2012/wordml" xmlns:w16cex="http://schemas.microsoft.com/office/word/2018/wordml/cex" xmlns:w16cid="http://schemas.microsoft.com/office/word/2016/wordml/cid" xmlns:w16="http://schemas.microsoft.com/office/word/2018/wordml" xmlns:w16sdtdh="http://schemas.microsoft.com/office/word/2020/wordml/sdtdatahash" xmlns:w16se="http://schemas.microsoft.com/office/word/2015/wordml/symex" xmlns:wpg="http://schemas.microsoft.com/office/word/2010/wordprocessingGroup" xmlns:wpi="http://schemas.microsoft.com/office/word/2010/wordprocessingInk" xmlns:wne="http://schemas.microsoft.com/office/word/2006/wordml" xmlns:wps="http://schemas.microsoft.com/office/word/2010/wordprocessingShape" mc:Ignorable="w14 w15 w16se w16cid w16 w16cex w16sdtdh wp14">
+<w:document xmlns:wpc="http://schemas.microsoft.com/office/word/2010/wordprocessingCanvas" xmlns:cx="http://schemas.microsoft.com/office/drawing/2014/chartex" xmlns:cx1="http://schemas.microsoft.com/office/drawing/2015/9/8/chartex" xmlns:cx2="http://schemas.microsoft.com/office/drawing/2015/10/21/chartex" xmlns:cx3="http://schemas.microsoft.com/office/drawing/2016/5/9/chartex" xmlns:cx4="http://schemas.microsoft.com/office/drawing/2016/5/10/chartex" xmlns:cx5="http://schemas.microsoft.com/office/drawing/2016/5/11/chartex" xmlns:cx6="http://schemas.microsoft.com/office/drawing/2016/5/12/chartex" xmlns:cx7="http://schemas.microsoft.com/office/drawing/2016/5/13/chartex" xmlns:cx8="http://schemas.microsoft.com/office/drawing/2016/5/14/chartex" xmlns:mc="http://schemas.openxmlformats.org/markup-compatibility/2006" xmlns:aink="http://schemas.microsoft.com/office/drawing/2016/ink" xmlns:am3d="http://schemas.microsoft.com/office/drawing/2017/model3d" xmlns:o="urn:schemas-microsoft-com:office:office" xmlns:oel="http://schemas.microsoft.com/office/2019/extlst" xmlns:r="http://schemas.openxmlformats.org/officeDocument/2006/relationships" xmlns:m="http://schemas.openxmlformats.org/officeDocument/2006/math" xmlns:v="urn:schemas-microsoft-com:vml" xmlns:wp14="http://schemas.microsoft.com/office/word/2010/wordprocessingDrawing" xmlns:wp="http://schemas.openxmlformats.org/drawingml/2006/wordprocessingDrawing" xmlns:w10="urn:schemas-microsoft-com:office:word" xmlns:w="http://schemas.openxmlformats.org/wordprocessingml/2006/main" xmlns:w14="http://schemas.microsoft.com/office/word/2010/wordml" xmlns:w15="http://schemas.microsoft.com/office/word/2012/wordml" xmlns:w16cex="http://schemas.microsoft.com/office/word/2018/wordml/cex" xmlns:w16cid="http://schemas.microsoft.com/office/word/2016/wordml/cid" xmlns:w16="http://schemas.microsoft.com/office/word/2018/wordml" xmlns:w16du="http://schemas.microsoft.com/office/word/2023/wordml/word16du" xmlns:w16sdtdh="http://schemas.microsoft.com/office/word/2020/wordml/sdtdatahash" xmlns:w16sdtfl="http://schemas.microsoft.com/office/word/2024/wordml/sdtformatlock" xmlns:w16se="http://schemas.microsoft.com/office/word/2015/wordml/symex" xmlns:wpg="http://schemas.microsoft.com/office/word/2010/wordprocessingGroup" xmlns:wpi="http://schemas.microsoft.com/office/word/2010/wordprocessingInk" xmlns:wne="http://schemas.microsoft.com/office/word/2006/wordml" xmlns:wps="http://schemas.microsoft.com/office/word/2010/wordprocessingShape" mc:Ignorable="w14 w15 w16se w16cid w16 w16cex w16sdtdh w16sdtfl w16du wp14">
   <w:body>
     <w:p>
       <w:pPr>
@@ -611,25 +611,14 @@
                 <w:lang w:val="en-US"/>
               </w:rPr>
             </w:pPr>
-            <w:proofErr w:type="spellStart"/>
-            <w:r>
-              <w:rPr>
-                <w:rFonts w:ascii="Verdana" w:hAnsi="Verdana" w:cs="Times New Roman"/>
-                <w:sz w:val="18"/>
-                <w:szCs w:val="20"/>
-                <w:lang w:val="en-US"/>
-              </w:rPr>
-              <w:t>Elif</w:t>
-            </w:r>
-            <w:proofErr w:type="spellEnd"/>
-            <w:r>
-              <w:rPr>
-                <w:rFonts w:ascii="Verdana" w:hAnsi="Verdana" w:cs="Times New Roman"/>
-                <w:sz w:val="18"/>
-                <w:szCs w:val="20"/>
-                <w:lang w:val="en-US"/>
-              </w:rPr>
-              <w:t xml:space="preserve"> </w:t>
+            <w:r>
+              <w:rPr>
+                <w:rFonts w:ascii="Verdana" w:hAnsi="Verdana" w:cs="Times New Roman"/>
+                <w:sz w:val="18"/>
+                <w:szCs w:val="20"/>
+                <w:lang w:val="en-US"/>
+              </w:rPr>
+              <w:t xml:space="preserve">Elif </w:t>
             </w:r>
             <w:proofErr w:type="spellStart"/>
             <w:r>
@@ -1162,25 +1151,14 @@
                 <w:lang w:val="en-US"/>
               </w:rPr>
             </w:pPr>
-            <w:proofErr w:type="spellStart"/>
-            <w:r>
-              <w:rPr>
-                <w:rFonts w:ascii="Verdana" w:hAnsi="Verdana" w:cs="Times New Roman"/>
-                <w:sz w:val="18"/>
-                <w:szCs w:val="20"/>
-                <w:lang w:val="en-US"/>
-              </w:rPr>
-              <w:t>Elif</w:t>
-            </w:r>
-            <w:proofErr w:type="spellEnd"/>
-            <w:r>
-              <w:rPr>
-                <w:rFonts w:ascii="Verdana" w:hAnsi="Verdana" w:cs="Times New Roman"/>
-                <w:sz w:val="18"/>
-                <w:szCs w:val="20"/>
-                <w:lang w:val="en-US"/>
-              </w:rPr>
-              <w:t xml:space="preserve"> </w:t>
+            <w:r>
+              <w:rPr>
+                <w:rFonts w:ascii="Verdana" w:hAnsi="Verdana" w:cs="Times New Roman"/>
+                <w:sz w:val="18"/>
+                <w:szCs w:val="20"/>
+                <w:lang w:val="en-US"/>
+              </w:rPr>
+              <w:t xml:space="preserve">Elif </w:t>
             </w:r>
             <w:proofErr w:type="spellStart"/>
             <w:r>
@@ -1208,6 +1186,33 @@
                 <w:lang w:val="en-US"/>
               </w:rPr>
             </w:pPr>
+            <w:r>
+              <w:rPr>
+                <w:rFonts w:ascii="Verdana" w:hAnsi="Verdana" w:cs="Times New Roman"/>
+                <w:sz w:val="18"/>
+                <w:szCs w:val="20"/>
+                <w:lang w:val="en-US"/>
+              </w:rPr>
+              <w:t xml:space="preserve">Feasibility report, data acquisition, </w:t>
+            </w:r>
+            <w:r>
+              <w:rPr>
+                <w:rFonts w:ascii="Verdana" w:hAnsi="Verdana" w:cs="Times New Roman"/>
+                <w:sz w:val="18"/>
+                <w:szCs w:val="20"/>
+                <w:lang w:val="en-US"/>
+              </w:rPr>
+              <w:t xml:space="preserve">initial </w:t>
+            </w:r>
+            <w:r>
+              <w:rPr>
+                <w:rFonts w:ascii="Verdana" w:hAnsi="Verdana" w:cs="Times New Roman"/>
+                <w:sz w:val="18"/>
+                <w:szCs w:val="20"/>
+                <w:lang w:val="en-US"/>
+              </w:rPr>
+              <w:t>analysis, final report</w:t>
+            </w:r>
           </w:p>
         </w:tc>
       </w:tr>
@@ -1734,7 +1739,7 @@
 </file>
 
 <file path=word/endnotes.xml><?xml version="1.0" encoding="utf-8"?>
-<w:endnotes xmlns:wpc="http://schemas.microsoft.com/office/word/2010/wordprocessingCanvas" xmlns:cx="http://schemas.microsoft.com/office/drawing/2014/chartex" xmlns:cx1="http://schemas.microsoft.com/office/drawing/2015/9/8/chartex" xmlns:cx2="http://schemas.microsoft.com/office/drawing/2015/10/21/chartex" xmlns:cx3="http://schemas.microsoft.com/office/drawing/2016/5/9/chartex" xmlns:cx4="http://schemas.microsoft.com/office/drawing/2016/5/10/chartex" xmlns:cx5="http://schemas.microsoft.com/office/drawing/2016/5/11/chartex" xmlns:cx6="http://schemas.microsoft.com/office/drawing/2016/5/12/chartex" xmlns:cx7="http://schemas.microsoft.com/office/drawing/2016/5/13/chartex" xmlns:cx8="http://schemas.microsoft.com/office/drawing/2016/5/14/chartex" xmlns:mc="http://schemas.openxmlformats.org/markup-compatibility/2006" xmlns:aink="http://schemas.microsoft.com/office/drawing/2016/ink" xmlns:am3d="http://schemas.microsoft.com/office/drawing/2017/model3d" xmlns:o="urn:schemas-microsoft-com:office:office" xmlns:oel="http://schemas.microsoft.com/office/2019/extlst" xmlns:r="http://schemas.openxmlformats.org/officeDocument/2006/relationships" xmlns:m="http://schemas.openxmlformats.org/officeDocument/2006/math" xmlns:v="urn:schemas-microsoft-com:vml" xmlns:wp14="http://schemas.microsoft.com/office/word/2010/wordprocessingDrawing" xmlns:wp="http://schemas.openxmlformats.org/drawingml/2006/wordprocessingDrawing" xmlns:w10="urn:schemas-microsoft-com:office:word" xmlns:w="http://schemas.openxmlformats.org/wordprocessingml/2006/main" xmlns:w14="http://schemas.microsoft.com/office/word/2010/wordml" xmlns:w15="http://schemas.microsoft.com/office/word/2012/wordml" xmlns:w16cex="http://schemas.microsoft.com/office/word/2018/wordml/cex" xmlns:w16cid="http://schemas.microsoft.com/office/word/2016/wordml/cid" xmlns:w16="http://schemas.microsoft.com/office/word/2018/wordml" xmlns:w16sdtdh="http://schemas.microsoft.com/office/word/2020/wordml/sdtdatahash" xmlns:w16se="http://schemas.microsoft.com/office/word/2015/wordml/symex" xmlns:wpg="http://schemas.microsoft.com/office/word/2010/wordprocessingGroup" xmlns:wpi="http://schemas.microsoft.com/office/word/2010/wordprocessingInk" xmlns:wne="http://schemas.microsoft.com/office/word/2006/wordml" xmlns:wps="http://schemas.microsoft.com/office/word/2010/wordprocessingShape" mc:Ignorable="w14 w15 w16se w16cid w16 w16cex w16sdtdh wp14">
+<w:endnotes xmlns:wpc="http://schemas.microsoft.com/office/word/2010/wordprocessingCanvas" xmlns:cx="http://schemas.microsoft.com/office/drawing/2014/chartex" xmlns:cx1="http://schemas.microsoft.com/office/drawing/2015/9/8/chartex" xmlns:cx2="http://schemas.microsoft.com/office/drawing/2015/10/21/chartex" xmlns:cx3="http://schemas.microsoft.com/office/drawing/2016/5/9/chartex" xmlns:cx4="http://schemas.microsoft.com/office/drawing/2016/5/10/chartex" xmlns:cx5="http://schemas.microsoft.com/office/drawing/2016/5/11/chartex" xmlns:cx6="http://schemas.microsoft.com/office/drawing/2016/5/12/chartex" xmlns:cx7="http://schemas.microsoft.com/office/drawing/2016/5/13/chartex" xmlns:cx8="http://schemas.microsoft.com/office/drawing/2016/5/14/chartex" xmlns:mc="http://schemas.openxmlformats.org/markup-compatibility/2006" xmlns:aink="http://schemas.microsoft.com/office/drawing/2016/ink" xmlns:am3d="http://schemas.microsoft.com/office/drawing/2017/model3d" xmlns:o="urn:schemas-microsoft-com:office:office" xmlns:oel="http://schemas.microsoft.com/office/2019/extlst" xmlns:r="http://schemas.openxmlformats.org/officeDocument/2006/relationships" xmlns:m="http://schemas.openxmlformats.org/officeDocument/2006/math" xmlns:v="urn:schemas-microsoft-com:vml" xmlns:wp14="http://schemas.microsoft.com/office/word/2010/wordprocessingDrawing" xmlns:wp="http://schemas.openxmlformats.org/drawingml/2006/wordprocessingDrawing" xmlns:w10="urn:schemas-microsoft-com:office:word" xmlns:w="http://schemas.openxmlformats.org/wordprocessingml/2006/main" xmlns:w14="http://schemas.microsoft.com/office/word/2010/wordml" xmlns:w15="http://schemas.microsoft.com/office/word/2012/wordml" xmlns:w16cex="http://schemas.microsoft.com/office/word/2018/wordml/cex" xmlns:w16cid="http://schemas.microsoft.com/office/word/2016/wordml/cid" xmlns:w16="http://schemas.microsoft.com/office/word/2018/wordml" xmlns:w16du="http://schemas.microsoft.com/office/word/2023/wordml/word16du" xmlns:w16sdtdh="http://schemas.microsoft.com/office/word/2020/wordml/sdtdatahash" xmlns:w16sdtfl="http://schemas.microsoft.com/office/word/2024/wordml/sdtformatlock" xmlns:w16se="http://schemas.microsoft.com/office/word/2015/wordml/symex" xmlns:wpg="http://schemas.microsoft.com/office/word/2010/wordprocessingGroup" xmlns:wpi="http://schemas.microsoft.com/office/word/2010/wordprocessingInk" xmlns:wne="http://schemas.microsoft.com/office/word/2006/wordml" xmlns:wps="http://schemas.microsoft.com/office/word/2010/wordprocessingShape" mc:Ignorable="w14 w15 w16se w16cid w16 w16cex w16sdtdh w16sdtfl w16du wp14">
   <w:endnote w:type="separator" w:id="-1">
     <w:p>
       <w:pPr>
@@ -1759,7 +1764,7 @@
 </file>
 
 <file path=word/footer1.xml><?xml version="1.0" encoding="utf-8"?>
-<w:ftr xmlns:wpc="http://schemas.microsoft.com/office/word/2010/wordprocessingCanvas" xmlns:cx="http://schemas.microsoft.com/office/drawing/2014/chartex" xmlns:cx1="http://schemas.microsoft.com/office/drawing/2015/9/8/chartex" xmlns:cx2="http://schemas.microsoft.com/office/drawing/2015/10/21/chartex" xmlns:cx3="http://schemas.microsoft.com/office/drawing/2016/5/9/chartex" xmlns:cx4="http://schemas.microsoft.com/office/drawing/2016/5/10/chartex" xmlns:cx5="http://schemas.microsoft.com/office/drawing/2016/5/11/chartex" xmlns:cx6="http://schemas.microsoft.com/office/drawing/2016/5/12/chartex" xmlns:cx7="http://schemas.microsoft.com/office/drawing/2016/5/13/chartex" xmlns:cx8="http://schemas.microsoft.com/office/drawing/2016/5/14/chartex" xmlns:mc="http://schemas.openxmlformats.org/markup-compatibility/2006" xmlns:aink="http://schemas.microsoft.com/office/drawing/2016/ink" xmlns:am3d="http://schemas.microsoft.com/office/drawing/2017/model3d" xmlns:o="urn:schemas-microsoft-com:office:office" xmlns:oel="http://schemas.microsoft.com/office/2019/extlst" xmlns:r="http://schemas.openxmlformats.org/officeDocument/2006/relationships" xmlns:m="http://schemas.openxmlformats.org/officeDocument/2006/math" xmlns:v="urn:schemas-microsoft-com:vml" xmlns:wp14="http://schemas.microsoft.com/office/word/2010/wordprocessingDrawing" xmlns:wp="http://schemas.openxmlformats.org/drawingml/2006/wordprocessingDrawing" xmlns:w10="urn:schemas-microsoft-com:office:word" xmlns:w="http://schemas.openxmlformats.org/wordprocessingml/2006/main" xmlns:w14="http://schemas.microsoft.com/office/word/2010/wordml" xmlns:w15="http://schemas.microsoft.com/office/word/2012/wordml" xmlns:w16cex="http://schemas.microsoft.com/office/word/2018/wordml/cex" xmlns:w16cid="http://schemas.microsoft.com/office/word/2016/wordml/cid" xmlns:w16="http://schemas.microsoft.com/office/word/2018/wordml" xmlns:w16sdtdh="http://schemas.microsoft.com/office/word/2020/wordml/sdtdatahash" xmlns:w16se="http://schemas.microsoft.com/office/word/2015/wordml/symex" xmlns:wpg="http://schemas.microsoft.com/office/word/2010/wordprocessingGroup" xmlns:wpi="http://schemas.microsoft.com/office/word/2010/wordprocessingInk" xmlns:wne="http://schemas.microsoft.com/office/word/2006/wordml" xmlns:wps="http://schemas.microsoft.com/office/word/2010/wordprocessingShape" mc:Ignorable="w14 w15 w16se w16cid w16 w16cex w16sdtdh wp14">
+<w:ftr xmlns:wpc="http://schemas.microsoft.com/office/word/2010/wordprocessingCanvas" xmlns:cx="http://schemas.microsoft.com/office/drawing/2014/chartex" xmlns:cx1="http://schemas.microsoft.com/office/drawing/2015/9/8/chartex" xmlns:cx2="http://schemas.microsoft.com/office/drawing/2015/10/21/chartex" xmlns:cx3="http://schemas.microsoft.com/office/drawing/2016/5/9/chartex" xmlns:cx4="http://schemas.microsoft.com/office/drawing/2016/5/10/chartex" xmlns:cx5="http://schemas.microsoft.com/office/drawing/2016/5/11/chartex" xmlns:cx6="http://schemas.microsoft.com/office/drawing/2016/5/12/chartex" xmlns:cx7="http://schemas.microsoft.com/office/drawing/2016/5/13/chartex" xmlns:cx8="http://schemas.microsoft.com/office/drawing/2016/5/14/chartex" xmlns:mc="http://schemas.openxmlformats.org/markup-compatibility/2006" xmlns:aink="http://schemas.microsoft.com/office/drawing/2016/ink" xmlns:am3d="http://schemas.microsoft.com/office/drawing/2017/model3d" xmlns:o="urn:schemas-microsoft-com:office:office" xmlns:oel="http://schemas.microsoft.com/office/2019/extlst" xmlns:r="http://schemas.openxmlformats.org/officeDocument/2006/relationships" xmlns:m="http://schemas.openxmlformats.org/officeDocument/2006/math" xmlns:v="urn:schemas-microsoft-com:vml" xmlns:wp14="http://schemas.microsoft.com/office/word/2010/wordprocessingDrawing" xmlns:wp="http://schemas.openxmlformats.org/drawingml/2006/wordprocessingDrawing" xmlns:w10="urn:schemas-microsoft-com:office:word" xmlns:w="http://schemas.openxmlformats.org/wordprocessingml/2006/main" xmlns:w14="http://schemas.microsoft.com/office/word/2010/wordml" xmlns:w15="http://schemas.microsoft.com/office/word/2012/wordml" xmlns:w16cex="http://schemas.microsoft.com/office/word/2018/wordml/cex" xmlns:w16cid="http://schemas.microsoft.com/office/word/2016/wordml/cid" xmlns:w16="http://schemas.microsoft.com/office/word/2018/wordml" xmlns:w16du="http://schemas.microsoft.com/office/word/2023/wordml/word16du" xmlns:w16sdtdh="http://schemas.microsoft.com/office/word/2020/wordml/sdtdatahash" xmlns:w16sdtfl="http://schemas.microsoft.com/office/word/2024/wordml/sdtformatlock" xmlns:w16se="http://schemas.microsoft.com/office/word/2015/wordml/symex" xmlns:wpg="http://schemas.microsoft.com/office/word/2010/wordprocessingGroup" xmlns:wpi="http://schemas.microsoft.com/office/word/2010/wordprocessingInk" xmlns:wne="http://schemas.microsoft.com/office/word/2006/wordml" xmlns:wps="http://schemas.microsoft.com/office/word/2010/wordprocessingShape" mc:Ignorable="w14 w15 w16se w16cid w16 w16cex w16sdtdh w16sdtfl w16du wp14">
   <w:p>
     <w:pPr>
       <w:pStyle w:val="Footer"/>
@@ -1773,7 +1778,7 @@
 </file>
 
 <file path=word/footnotes.xml><?xml version="1.0" encoding="utf-8"?>
-<w:footnotes xmlns:wpc="http://schemas.microsoft.com/office/word/2010/wordprocessingCanvas" xmlns:cx="http://schemas.microsoft.com/office/drawing/2014/chartex" xmlns:cx1="http://schemas.microsoft.com/office/drawing/2015/9/8/chartex" xmlns:cx2="http://schemas.microsoft.com/office/drawing/2015/10/21/chartex" xmlns:cx3="http://schemas.microsoft.com/office/drawing/2016/5/9/chartex" xmlns:cx4="http://schemas.microsoft.com/office/drawing/2016/5/10/chartex" xmlns:cx5="http://schemas.microsoft.com/office/drawing/2016/5/11/chartex" xmlns:cx6="http://schemas.microsoft.com/office/drawing/2016/5/12/chartex" xmlns:cx7="http://schemas.microsoft.com/office/drawing/2016/5/13/chartex" xmlns:cx8="http://schemas.microsoft.com/office/drawing/2016/5/14/chartex" xmlns:mc="http://schemas.openxmlformats.org/markup-compatibility/2006" xmlns:aink="http://schemas.microsoft.com/office/drawing/2016/ink" xmlns:am3d="http://schemas.microsoft.com/office/drawing/2017/model3d" xmlns:o="urn:schemas-microsoft-com:office:office" xmlns:oel="http://schemas.microsoft.com/office/2019/extlst" xmlns:r="http://schemas.openxmlformats.org/officeDocument/2006/relationships" xmlns:m="http://schemas.openxmlformats.org/officeDocument/2006/math" xmlns:v="urn:schemas-microsoft-com:vml" xmlns:wp14="http://schemas.microsoft.com/office/word/2010/wordprocessingDrawing" xmlns:wp="http://schemas.openxmlformats.org/drawingml/2006/wordprocessingDrawing" xmlns:w10="urn:schemas-microsoft-com:office:word" xmlns:w="http://schemas.openxmlformats.org/wordprocessingml/2006/main" xmlns:w14="http://schemas.microsoft.com/office/word/2010/wordml" xmlns:w15="http://schemas.microsoft.com/office/word/2012/wordml" xmlns:w16cex="http://schemas.microsoft.com/office/word/2018/wordml/cex" xmlns:w16cid="http://schemas.microsoft.com/office/word/2016/wordml/cid" xmlns:w16="http://schemas.microsoft.com/office/word/2018/wordml" xmlns:w16sdtdh="http://schemas.microsoft.com/office/word/2020/wordml/sdtdatahash" xmlns:w16se="http://schemas.microsoft.com/office/word/2015/wordml/symex" xmlns:wpg="http://schemas.microsoft.com/office/word/2010/wordprocessingGroup" xmlns:wpi="http://schemas.microsoft.com/office/word/2010/wordprocessingInk" xmlns:wne="http://schemas.microsoft.com/office/word/2006/wordml" xmlns:wps="http://schemas.microsoft.com/office/word/2010/wordprocessingShape" mc:Ignorable="w14 w15 w16se w16cid w16 w16cex w16sdtdh wp14">
+<w:footnotes xmlns:wpc="http://schemas.microsoft.com/office/word/2010/wordprocessingCanvas" xmlns:cx="http://schemas.microsoft.com/office/drawing/2014/chartex" xmlns:cx1="http://schemas.microsoft.com/office/drawing/2015/9/8/chartex" xmlns:cx2="http://schemas.microsoft.com/office/drawing/2015/10/21/chartex" xmlns:cx3="http://schemas.microsoft.com/office/drawing/2016/5/9/chartex" xmlns:cx4="http://schemas.microsoft.com/office/drawing/2016/5/10/chartex" xmlns:cx5="http://schemas.microsoft.com/office/drawing/2016/5/11/chartex" xmlns:cx6="http://schemas.microsoft.com/office/drawing/2016/5/12/chartex" xmlns:cx7="http://schemas.microsoft.com/office/drawing/2016/5/13/chartex" xmlns:cx8="http://schemas.microsoft.com/office/drawing/2016/5/14/chartex" xmlns:mc="http://schemas.openxmlformats.org/markup-compatibility/2006" xmlns:aink="http://schemas.microsoft.com/office/drawing/2016/ink" xmlns:am3d="http://schemas.microsoft.com/office/drawing/2017/model3d" xmlns:o="urn:schemas-microsoft-com:office:office" xmlns:oel="http://schemas.microsoft.com/office/2019/extlst" xmlns:r="http://schemas.openxmlformats.org/officeDocument/2006/relationships" xmlns:m="http://schemas.openxmlformats.org/officeDocument/2006/math" xmlns:v="urn:schemas-microsoft-com:vml" xmlns:wp14="http://schemas.microsoft.com/office/word/2010/wordprocessingDrawing" xmlns:wp="http://schemas.openxmlformats.org/drawingml/2006/wordprocessingDrawing" xmlns:w10="urn:schemas-microsoft-com:office:word" xmlns:w="http://schemas.openxmlformats.org/wordprocessingml/2006/main" xmlns:w14="http://schemas.microsoft.com/office/word/2010/wordml" xmlns:w15="http://schemas.microsoft.com/office/word/2012/wordml" xmlns:w16cex="http://schemas.microsoft.com/office/word/2018/wordml/cex" xmlns:w16cid="http://schemas.microsoft.com/office/word/2016/wordml/cid" xmlns:w16="http://schemas.microsoft.com/office/word/2018/wordml" xmlns:w16du="http://schemas.microsoft.com/office/word/2023/wordml/word16du" xmlns:w16sdtdh="http://schemas.microsoft.com/office/word/2020/wordml/sdtdatahash" xmlns:w16sdtfl="http://schemas.microsoft.com/office/word/2024/wordml/sdtformatlock" xmlns:w16se="http://schemas.microsoft.com/office/word/2015/wordml/symex" xmlns:wpg="http://schemas.microsoft.com/office/word/2010/wordprocessingGroup" xmlns:wpi="http://schemas.microsoft.com/office/word/2010/wordprocessingInk" xmlns:wne="http://schemas.microsoft.com/office/word/2006/wordml" xmlns:wps="http://schemas.microsoft.com/office/word/2010/wordprocessingShape" mc:Ignorable="w14 w15 w16se w16cid w16 w16cex w16sdtdh w16sdtfl w16du wp14">
   <w:footnote w:type="separator" w:id="-1">
     <w:p>
       <w:pPr>
@@ -1798,7 +1803,7 @@
 </file>
 
 <file path=word/header1.xml><?xml version="1.0" encoding="utf-8"?>
-<w:hdr xmlns:wpc="http://schemas.microsoft.com/office/word/2010/wordprocessingCanvas" xmlns:cx="http://schemas.microsoft.com/office/drawing/2014/chartex" xmlns:cx1="http://schemas.microsoft.com/office/drawing/2015/9/8/chartex" xmlns:cx2="http://schemas.microsoft.com/office/drawing/2015/10/21/chartex" xmlns:cx3="http://schemas.microsoft.com/office/drawing/2016/5/9/chartex" xmlns:cx4="http://schemas.microsoft.com/office/drawing/2016/5/10/chartex" xmlns:cx5="http://schemas.microsoft.com/office/drawing/2016/5/11/chartex" xmlns:cx6="http://schemas.microsoft.com/office/drawing/2016/5/12/chartex" xmlns:cx7="http://schemas.microsoft.com/office/drawing/2016/5/13/chartex" xmlns:cx8="http://schemas.microsoft.com/office/drawing/2016/5/14/chartex" xmlns:mc="http://schemas.openxmlformats.org/markup-compatibility/2006" xmlns:aink="http://schemas.microsoft.com/office/drawing/2016/ink" xmlns:am3d="http://schemas.microsoft.com/office/drawing/2017/model3d" xmlns:o="urn:schemas-microsoft-com:office:office" xmlns:oel="http://schemas.microsoft.com/office/2019/extlst" xmlns:r="http://schemas.openxmlformats.org/officeDocument/2006/relationships" xmlns:m="http://schemas.openxmlformats.org/officeDocument/2006/math" xmlns:v="urn:schemas-microsoft-com:vml" xmlns:wp14="http://schemas.microsoft.com/office/word/2010/wordprocessingDrawing" xmlns:wp="http://schemas.openxmlformats.org/drawingml/2006/wordprocessingDrawing" xmlns:w10="urn:schemas-microsoft-com:office:word" xmlns:w="http://schemas.openxmlformats.org/wordprocessingml/2006/main" xmlns:w14="http://schemas.microsoft.com/office/word/2010/wordml" xmlns:w15="http://schemas.microsoft.com/office/word/2012/wordml" xmlns:w16cex="http://schemas.microsoft.com/office/word/2018/wordml/cex" xmlns:w16cid="http://schemas.microsoft.com/office/word/2016/wordml/cid" xmlns:w16="http://schemas.microsoft.com/office/word/2018/wordml" xmlns:w16sdtdh="http://schemas.microsoft.com/office/word/2020/wordml/sdtdatahash" xmlns:w16se="http://schemas.microsoft.com/office/word/2015/wordml/symex" xmlns:wpg="http://schemas.microsoft.com/office/word/2010/wordprocessingGroup" xmlns:wpi="http://schemas.microsoft.com/office/word/2010/wordprocessingInk" xmlns:wne="http://schemas.microsoft.com/office/word/2006/wordml" xmlns:wps="http://schemas.microsoft.com/office/word/2010/wordprocessingShape" mc:Ignorable="w14 w15 w16se w16cid w16 w16cex w16sdtdh wp14">
+<w:hdr xmlns:wpc="http://schemas.microsoft.com/office/word/2010/wordprocessingCanvas" xmlns:cx="http://schemas.microsoft.com/office/drawing/2014/chartex" xmlns:cx1="http://schemas.microsoft.com/office/drawing/2015/9/8/chartex" xmlns:cx2="http://schemas.microsoft.com/office/drawing/2015/10/21/chartex" xmlns:cx3="http://schemas.microsoft.com/office/drawing/2016/5/9/chartex" xmlns:cx4="http://schemas.microsoft.com/office/drawing/2016/5/10/chartex" xmlns:cx5="http://schemas.microsoft.com/office/drawing/2016/5/11/chartex" xmlns:cx6="http://schemas.microsoft.com/office/drawing/2016/5/12/chartex" xmlns:cx7="http://schemas.microsoft.com/office/drawing/2016/5/13/chartex" xmlns:cx8="http://schemas.microsoft.com/office/drawing/2016/5/14/chartex" xmlns:mc="http://schemas.openxmlformats.org/markup-compatibility/2006" xmlns:aink="http://schemas.microsoft.com/office/drawing/2016/ink" xmlns:am3d="http://schemas.microsoft.com/office/drawing/2017/model3d" xmlns:o="urn:schemas-microsoft-com:office:office" xmlns:oel="http://schemas.microsoft.com/office/2019/extlst" xmlns:r="http://schemas.openxmlformats.org/officeDocument/2006/relationships" xmlns:m="http://schemas.openxmlformats.org/officeDocument/2006/math" xmlns:v="urn:schemas-microsoft-com:vml" xmlns:wp14="http://schemas.microsoft.com/office/word/2010/wordprocessingDrawing" xmlns:wp="http://schemas.openxmlformats.org/drawingml/2006/wordprocessingDrawing" xmlns:w10="urn:schemas-microsoft-com:office:word" xmlns:w="http://schemas.openxmlformats.org/wordprocessingml/2006/main" xmlns:w14="http://schemas.microsoft.com/office/word/2010/wordml" xmlns:w15="http://schemas.microsoft.com/office/word/2012/wordml" xmlns:w16cex="http://schemas.microsoft.com/office/word/2018/wordml/cex" xmlns:w16cid="http://schemas.microsoft.com/office/word/2016/wordml/cid" xmlns:w16="http://schemas.microsoft.com/office/word/2018/wordml" xmlns:w16du="http://schemas.microsoft.com/office/word/2023/wordml/word16du" xmlns:w16sdtdh="http://schemas.microsoft.com/office/word/2020/wordml/sdtdatahash" xmlns:w16sdtfl="http://schemas.microsoft.com/office/word/2024/wordml/sdtformatlock" xmlns:w16se="http://schemas.microsoft.com/office/word/2015/wordml/symex" xmlns:wpg="http://schemas.microsoft.com/office/word/2010/wordprocessingGroup" xmlns:wpi="http://schemas.microsoft.com/office/word/2010/wordprocessingInk" xmlns:wne="http://schemas.microsoft.com/office/word/2006/wordml" xmlns:wps="http://schemas.microsoft.com/office/word/2010/wordprocessingShape" mc:Ignorable="w14 w15 w16se w16cid w16 w16cex w16sdtdh w16sdtfl w16du wp14">
   <w:p>
     <w:pPr>
       <w:pBdr>
@@ -1925,7 +1930,7 @@
 </file>
 
 <file path=word/numbering.xml><?xml version="1.0" encoding="utf-8"?>
-<w:numbering xmlns:wpc="http://schemas.microsoft.com/office/word/2010/wordprocessingCanvas" xmlns:cx="http://schemas.microsoft.com/office/drawing/2014/chartex" xmlns:cx1="http://schemas.microsoft.com/office/drawing/2015/9/8/chartex" xmlns:cx2="http://schemas.microsoft.com/office/drawing/2015/10/21/chartex" xmlns:cx3="http://schemas.microsoft.com/office/drawing/2016/5/9/chartex" xmlns:cx4="http://schemas.microsoft.com/office/drawing/2016/5/10/chartex" xmlns:cx5="http://schemas.microsoft.com/office/drawing/2016/5/11/chartex" xmlns:cx6="http://schemas.microsoft.com/office/drawing/2016/5/12/chartex" xmlns:cx7="http://schemas.microsoft.com/office/drawing/2016/5/13/chartex" xmlns:cx8="http://schemas.microsoft.com/office/drawing/2016/5/14/chartex" xmlns:mc="http://schemas.openxmlformats.org/markup-compatibility/2006" xmlns:aink="http://schemas.microsoft.com/office/drawing/2016/ink" xmlns:am3d="http://schemas.microsoft.com/office/drawing/2017/model3d" xmlns:o="urn:schemas-microsoft-com:office:office" xmlns:oel="http://schemas.microsoft.com/office/2019/extlst" xmlns:r="http://schemas.openxmlformats.org/officeDocument/2006/relationships" xmlns:m="http://schemas.openxmlformats.org/officeDocument/2006/math" xmlns:v="urn:schemas-microsoft-com:vml" xmlns:wp14="http://schemas.microsoft.com/office/word/2010/wordprocessingDrawing" xmlns:wp="http://schemas.openxmlformats.org/drawingml/2006/wordprocessingDrawing" xmlns:w10="urn:schemas-microsoft-com:office:word" xmlns:w="http://schemas.openxmlformats.org/wordprocessingml/2006/main" xmlns:w14="http://schemas.microsoft.com/office/word/2010/wordml" xmlns:w15="http://schemas.microsoft.com/office/word/2012/wordml" xmlns:w16cex="http://schemas.microsoft.com/office/word/2018/wordml/cex" xmlns:w16cid="http://schemas.microsoft.com/office/word/2016/wordml/cid" xmlns:w16="http://schemas.microsoft.com/office/word/2018/wordml" xmlns:w16sdtdh="http://schemas.microsoft.com/office/word/2020/wordml/sdtdatahash" xmlns:w16se="http://schemas.microsoft.com/office/word/2015/wordml/symex" xmlns:wpg="http://schemas.microsoft.com/office/word/2010/wordprocessingGroup" xmlns:wpi="http://schemas.microsoft.com/office/word/2010/wordprocessingInk" xmlns:wne="http://schemas.microsoft.com/office/word/2006/wordml" xmlns:wps="http://schemas.microsoft.com/office/word/2010/wordprocessingShape" mc:Ignorable="w14 w15 w16se w16cid w16 w16cex w16sdtdh wp14">
+<w:numbering xmlns:wpc="http://schemas.microsoft.com/office/word/2010/wordprocessingCanvas" xmlns:cx="http://schemas.microsoft.com/office/drawing/2014/chartex" xmlns:cx1="http://schemas.microsoft.com/office/drawing/2015/9/8/chartex" xmlns:cx2="http://schemas.microsoft.com/office/drawing/2015/10/21/chartex" xmlns:cx3="http://schemas.microsoft.com/office/drawing/2016/5/9/chartex" xmlns:cx4="http://schemas.microsoft.com/office/drawing/2016/5/10/chartex" xmlns:cx5="http://schemas.microsoft.com/office/drawing/2016/5/11/chartex" xmlns:cx6="http://schemas.microsoft.com/office/drawing/2016/5/12/chartex" xmlns:cx7="http://schemas.microsoft.com/office/drawing/2016/5/13/chartex" xmlns:cx8="http://schemas.microsoft.com/office/drawing/2016/5/14/chartex" xmlns:mc="http://schemas.openxmlformats.org/markup-compatibility/2006" xmlns:aink="http://schemas.microsoft.com/office/drawing/2016/ink" xmlns:am3d="http://schemas.microsoft.com/office/drawing/2017/model3d" xmlns:o="urn:schemas-microsoft-com:office:office" xmlns:oel="http://schemas.microsoft.com/office/2019/extlst" xmlns:r="http://schemas.openxmlformats.org/officeDocument/2006/relationships" xmlns:m="http://schemas.openxmlformats.org/officeDocument/2006/math" xmlns:v="urn:schemas-microsoft-com:vml" xmlns:wp14="http://schemas.microsoft.com/office/word/2010/wordprocessingDrawing" xmlns:wp="http://schemas.openxmlformats.org/drawingml/2006/wordprocessingDrawing" xmlns:w10="urn:schemas-microsoft-com:office:word" xmlns:w="http://schemas.openxmlformats.org/wordprocessingml/2006/main" xmlns:w14="http://schemas.microsoft.com/office/word/2010/wordml" xmlns:w15="http://schemas.microsoft.com/office/word/2012/wordml" xmlns:w16cex="http://schemas.microsoft.com/office/word/2018/wordml/cex" xmlns:w16cid="http://schemas.microsoft.com/office/word/2016/wordml/cid" xmlns:w16="http://schemas.microsoft.com/office/word/2018/wordml" xmlns:w16du="http://schemas.microsoft.com/office/word/2023/wordml/word16du" xmlns:w16sdtdh="http://schemas.microsoft.com/office/word/2020/wordml/sdtdatahash" xmlns:w16sdtfl="http://schemas.microsoft.com/office/word/2024/wordml/sdtformatlock" xmlns:w16se="http://schemas.microsoft.com/office/word/2015/wordml/symex" xmlns:wpg="http://schemas.microsoft.com/office/word/2010/wordprocessingGroup" xmlns:wpi="http://schemas.microsoft.com/office/word/2010/wordprocessingInk" xmlns:wne="http://schemas.microsoft.com/office/word/2006/wordml" xmlns:wps="http://schemas.microsoft.com/office/word/2010/wordprocessingShape" mc:Ignorable="w14 w15 w16se w16cid w16 w16cex w16sdtdh w16sdtfl w16du wp14">
   <w:abstractNum w:abstractNumId="0" w15:restartNumberingAfterBreak="0">
     <w:nsid w:val="00D80EEB"/>
     <w:multiLevelType w:val="hybridMultilevel"/>
@@ -3193,7 +3198,7 @@
 </file>
 
 <file path=word/styles.xml><?xml version="1.0" encoding="utf-8"?>
-<w:styles xmlns:mc="http://schemas.openxmlformats.org/markup-compatibility/2006" xmlns:r="http://schemas.openxmlformats.org/officeDocument/2006/relationships" xmlns:w="http://schemas.openxmlformats.org/wordprocessingml/2006/main" xmlns:w14="http://schemas.microsoft.com/office/word/2010/wordml" xmlns:w15="http://schemas.microsoft.com/office/word/2012/wordml" xmlns:w16cex="http://schemas.microsoft.com/office/word/2018/wordml/cex" xmlns:w16cid="http://schemas.microsoft.com/office/word/2016/wordml/cid" xmlns:w16="http://schemas.microsoft.com/office/word/2018/wordml" xmlns:w16sdtdh="http://schemas.microsoft.com/office/word/2020/wordml/sdtdatahash" xmlns:w16se="http://schemas.microsoft.com/office/word/2015/wordml/symex" mc:Ignorable="w14 w15 w16se w16cid w16 w16cex w16sdtdh">
+<w:styles xmlns:mc="http://schemas.openxmlformats.org/markup-compatibility/2006" xmlns:r="http://schemas.openxmlformats.org/officeDocument/2006/relationships" xmlns:w="http://schemas.openxmlformats.org/wordprocessingml/2006/main" xmlns:w14="http://schemas.microsoft.com/office/word/2010/wordml" xmlns:w15="http://schemas.microsoft.com/office/word/2012/wordml" xmlns:w16cex="http://schemas.microsoft.com/office/word/2018/wordml/cex" xmlns:w16cid="http://schemas.microsoft.com/office/word/2016/wordml/cid" xmlns:w16="http://schemas.microsoft.com/office/word/2018/wordml" xmlns:w16du="http://schemas.microsoft.com/office/word/2023/wordml/word16du" xmlns:w16sdtdh="http://schemas.microsoft.com/office/word/2020/wordml/sdtdatahash" xmlns:w16sdtfl="http://schemas.microsoft.com/office/word/2024/wordml/sdtformatlock" xmlns:w16se="http://schemas.microsoft.com/office/word/2015/wordml/symex" mc:Ignorable="w14 w15 w16se w16cid w16 w16cex w16sdtdh w16sdtfl w16du">
   <w:docDefaults>
     <w:rPrDefault>
       <w:rPr>
@@ -4095,15 +4100,6 @@
 </file>
 
 <file path=customXml/item1.xml><?xml version="1.0" encoding="utf-8"?>
-<?mso-contentType ?>
-<FormTemplates xmlns="http://schemas.microsoft.com/sharepoint/v3/contenttype/forms">
-  <Display>DocumentLibraryForm</Display>
-  <Edit>DocumentLibraryForm</Edit>
-  <New>DocumentLibraryForm</New>
-</FormTemplates>
-</file>
-
-<file path=customXml/item2.xml><?xml version="1.0" encoding="utf-8"?>
 <ct:contentTypeSchema xmlns:ct="http://schemas.microsoft.com/office/2006/metadata/contentType" xmlns:ma="http://schemas.microsoft.com/office/2006/metadata/properties/metaAttributes" ct:_="" ma:_="" ma:contentTypeName="Dokument" ma:contentTypeID="0x010100D83DA77A80234049807C58E4A25BE38C" ma:contentTypeVersion="5" ma:contentTypeDescription="Ein neues Dokument erstellen." ma:contentTypeScope="" ma:versionID="d0084e7b1c45919e27b85d29628aae2d">
   <xsd:schema xmlns:xsd="http://www.w3.org/2001/XMLSchema" xmlns:xs="http://www.w3.org/2001/XMLSchema" xmlns:p="http://schemas.microsoft.com/office/2006/metadata/properties" xmlns:ns2="1e3117dc-5aaf-4142-9268-a1911add3cce" targetNamespace="http://schemas.microsoft.com/office/2006/metadata/properties" ma:root="true" ma:fieldsID="8fa2ca1bd92a0d95878a028a36fb3fa4" ns2:_="">
     <xsd:import namespace="1e3117dc-5aaf-4142-9268-a1911add3cce"/>
@@ -4255,6 +4251,15 @@
 </ct:contentTypeSchema>
 </file>
 
+<file path=customXml/item2.xml><?xml version="1.0" encoding="utf-8"?>
+<?mso-contentType ?>
+<FormTemplates xmlns="http://schemas.microsoft.com/sharepoint/v3/contenttype/forms">
+  <Display>DocumentLibraryForm</Display>
+  <Edit>DocumentLibraryForm</Edit>
+  <New>DocumentLibraryForm</New>
+</FormTemplates>
+</file>
+
 <file path=customXml/item3.xml><?xml version="1.0" encoding="utf-8"?>
 <p:properties xmlns:p="http://schemas.microsoft.com/office/2006/metadata/properties" xmlns:xsi="http://www.w3.org/2001/XMLSchema-instance" xmlns:pc="http://schemas.microsoft.com/office/infopath/2007/PartnerControls">
   <documentManagement/>
@@ -4262,14 +4267,6 @@
 </file>
 
 <file path=customXml/itemProps1.xml><?xml version="1.0" encoding="utf-8"?>
-<ds:datastoreItem xmlns:ds="http://schemas.openxmlformats.org/officeDocument/2006/customXml" ds:itemID="{1E34AC62-B1AB-438B-901E-95E407C1BAA9}">
-  <ds:schemaRefs>
-    <ds:schemaRef ds:uri="http://schemas.microsoft.com/sharepoint/v3/contenttype/forms"/>
-  </ds:schemaRefs>
-</ds:datastoreItem>
-</file>
-
-<file path=customXml/itemProps2.xml><?xml version="1.0" encoding="utf-8"?>
 <ds:datastoreItem xmlns:ds="http://schemas.openxmlformats.org/officeDocument/2006/customXml" ds:itemID="{51ED0B2F-805E-4D6D-AD15-521E248102FC}">
   <ds:schemaRefs>
     <ds:schemaRef ds:uri="http://schemas.microsoft.com/office/2006/metadata/contentType"/>
@@ -4287,6 +4284,14 @@
 </ds:datastoreItem>
 </file>
 
+<file path=customXml/itemProps2.xml><?xml version="1.0" encoding="utf-8"?>
+<ds:datastoreItem xmlns:ds="http://schemas.openxmlformats.org/officeDocument/2006/customXml" ds:itemID="{1E34AC62-B1AB-438B-901E-95E407C1BAA9}">
+  <ds:schemaRefs>
+    <ds:schemaRef ds:uri="http://schemas.microsoft.com/sharepoint/v3/contenttype/forms"/>
+  </ds:schemaRefs>
+</ds:datastoreItem>
+</file>
+
 <file path=customXml/itemProps3.xml><?xml version="1.0" encoding="utf-8"?>
 <ds:datastoreItem xmlns:ds="http://schemas.openxmlformats.org/officeDocument/2006/customXml" ds:itemID="{BCEA85C6-4168-48EE-AC75-2B95D967445C}">
   <ds:schemaRefs>

</xml_diff>